<commit_message>
finished design section 3
</commit_message>
<xml_diff>
--- a/Design/(3) data_overview.docx
+++ b/Design/(3) data_overview.docx
@@ -621,7 +621,263 @@
         <w:t>3.3 Example Charts</w:t>
       </w:r>
     </w:p>
-    <w:p/>
+    <w:p>
+      <w:r>
+        <w:t xml:space="preserve">Each of these were made using </w:t>
+      </w:r>
+      <w:r>
+        <w:rPr>
+          <w:b/>
+          <w:bCs/>
+        </w:rPr>
+        <w:t>Recharts</w:t>
+      </w:r>
+      <w:r>
+        <w:t xml:space="preserve"> and so reflect how they will look like after implementation.</w:t>
+      </w:r>
+    </w:p>
+    <w:p>
+      <w:r>
+        <w:rPr>
+          <w:b/>
+          <w:bCs/>
+        </w:rPr>
+        <w:t>Bar Chart</w:t>
+      </w:r>
+    </w:p>
+    <w:p>
+      <w:pPr>
+        <w:rPr>
+          <w:b/>
+          <w:bCs/>
+        </w:rPr>
+      </w:pPr>
+      <w:r>
+        <w:rPr>
+          <w:b/>
+          <w:bCs/>
+        </w:rPr>
+        <w:lastRenderedPageBreak/>
+        <w:drawing>
+          <wp:inline distT="0" distB="0" distL="0" distR="0" wp14:anchorId="45AE3905" wp14:editId="0E7EDADB">
+            <wp:extent cx="5731510" cy="3239770"/>
+            <wp:effectExtent l="0" t="0" r="2540" b="0"/>
+            <wp:docPr id="1552471627" name="Picture 1" descr="A graph of a graph&#10;&#10;AI-generated content may be incorrect."/>
+            <wp:cNvGraphicFramePr>
+              <a:graphicFrameLocks xmlns:a="http://schemas.openxmlformats.org/drawingml/2006/main" noChangeAspect="1"/>
+            </wp:cNvGraphicFramePr>
+            <a:graphic xmlns:a="http://schemas.openxmlformats.org/drawingml/2006/main">
+              <a:graphicData uri="http://schemas.openxmlformats.org/drawingml/2006/picture">
+                <pic:pic xmlns:pic="http://schemas.openxmlformats.org/drawingml/2006/picture">
+                  <pic:nvPicPr>
+                    <pic:cNvPr id="1552471627" name="Picture 1" descr="A graph of a graph&#10;&#10;AI-generated content may be incorrect."/>
+                    <pic:cNvPicPr/>
+                  </pic:nvPicPr>
+                  <pic:blipFill>
+                    <a:blip r:embed="rId6"/>
+                    <a:stretch>
+                      <a:fillRect/>
+                    </a:stretch>
+                  </pic:blipFill>
+                  <pic:spPr>
+                    <a:xfrm>
+                      <a:off x="0" y="0"/>
+                      <a:ext cx="5731510" cy="3239770"/>
+                    </a:xfrm>
+                    <a:prstGeom prst="rect">
+                      <a:avLst/>
+                    </a:prstGeom>
+                  </pic:spPr>
+                </pic:pic>
+              </a:graphicData>
+            </a:graphic>
+          </wp:inline>
+        </w:drawing>
+      </w:r>
+    </w:p>
+    <w:p>
+      <w:r>
+        <w:t xml:space="preserve">Notice the colours contrasting to each other to make it easy to distinguish between who the data is representing and therefore meeting </w:t>
+      </w:r>
+      <w:r>
+        <w:rPr>
+          <w:b/>
+          <w:bCs/>
+          <w:u w:val="single"/>
+        </w:rPr>
+        <w:t>Requirement 2.1.6</w:t>
+      </w:r>
+      <w:r>
+        <w:t xml:space="preserve">. The colour chosen for the text is also contrasting to the background, meeting </w:t>
+      </w:r>
+      <w:r>
+        <w:rPr>
+          <w:b/>
+          <w:bCs/>
+          <w:u w:val="single"/>
+        </w:rPr>
+        <w:t>Requirement 2.1.4</w:t>
+      </w:r>
+      <w:r>
+        <w:t>, with the tick text (numbers + names) being slightly less contrasting to decrease noise on the screen for a cleaner aesthetic.</w:t>
+      </w:r>
+    </w:p>
+    <w:p>
+      <w:r>
+        <w:rPr>
+          <w:b/>
+          <w:bCs/>
+        </w:rPr>
+        <w:t>Stacked Bar Chart</w:t>
+      </w:r>
+    </w:p>
+    <w:p>
+      <w:r>
+        <w:drawing>
+          <wp:inline distT="0" distB="0" distL="0" distR="0" wp14:anchorId="0DD2FFB5" wp14:editId="0CCA7E8B">
+            <wp:extent cx="5731510" cy="3595370"/>
+            <wp:effectExtent l="0" t="0" r="2540" b="5080"/>
+            <wp:docPr id="2032305481" name="Picture 1" descr="A screenshot of a graph&#10;&#10;AI-generated content may be incorrect."/>
+            <wp:cNvGraphicFramePr>
+              <a:graphicFrameLocks xmlns:a="http://schemas.openxmlformats.org/drawingml/2006/main" noChangeAspect="1"/>
+            </wp:cNvGraphicFramePr>
+            <a:graphic xmlns:a="http://schemas.openxmlformats.org/drawingml/2006/main">
+              <a:graphicData uri="http://schemas.openxmlformats.org/drawingml/2006/picture">
+                <pic:pic xmlns:pic="http://schemas.openxmlformats.org/drawingml/2006/picture">
+                  <pic:nvPicPr>
+                    <pic:cNvPr id="2032305481" name="Picture 1" descr="A screenshot of a graph&#10;&#10;AI-generated content may be incorrect."/>
+                    <pic:cNvPicPr/>
+                  </pic:nvPicPr>
+                  <pic:blipFill>
+                    <a:blip r:embed="rId7"/>
+                    <a:stretch>
+                      <a:fillRect/>
+                    </a:stretch>
+                  </pic:blipFill>
+                  <pic:spPr>
+                    <a:xfrm>
+                      <a:off x="0" y="0"/>
+                      <a:ext cx="5731510" cy="3595370"/>
+                    </a:xfrm>
+                    <a:prstGeom prst="rect">
+                      <a:avLst/>
+                    </a:prstGeom>
+                  </pic:spPr>
+                </pic:pic>
+              </a:graphicData>
+            </a:graphic>
+          </wp:inline>
+        </w:drawing>
+      </w:r>
+    </w:p>
+    <w:p>
+      <w:r>
+        <w:t xml:space="preserve">After experimenting with different colours for each statistic on the stacked bar chart (ground, low, high), the cleanest solution was to simply use darker colours for the statistics, this way the colours </w:t>
+      </w:r>
+      <w:r>
+        <w:lastRenderedPageBreak/>
+        <w:t xml:space="preserve">are kept consistent with the standard bar charts, meeting </w:t>
+      </w:r>
+      <w:r>
+        <w:rPr>
+          <w:b/>
+          <w:bCs/>
+          <w:u w:val="single"/>
+        </w:rPr>
+        <w:t>Requirement 2.1.5</w:t>
+      </w:r>
+      <w:r>
+        <w:t>, though trading that consistency for less contrast</w:t>
+      </w:r>
+      <w:r>
+        <w:t xml:space="preserve">. </w:t>
+      </w:r>
+    </w:p>
+    <w:p>
+      <w:r>
+        <w:t>The legend only shows the colours for the user, but they can easily infer that the extend of the shade of the colour correlates with the different statistics.</w:t>
+      </w:r>
+    </w:p>
+    <w:p>
+      <w:r>
+        <w:t>The tooltip included with Recharts helps show the exact values if the user wishes to know them, since it can otherwise be difficult to gauge.</w:t>
+      </w:r>
+    </w:p>
+    <w:p>
+      <w:pPr>
+        <w:rPr>
+          <w:b/>
+          <w:bCs/>
+        </w:rPr>
+      </w:pPr>
+      <w:r>
+        <w:rPr>
+          <w:b/>
+          <w:bCs/>
+        </w:rPr>
+        <w:t>Pie Chart</w:t>
+      </w:r>
+    </w:p>
+    <w:p>
+      <w:r>
+        <w:drawing>
+          <wp:inline distT="0" distB="0" distL="0" distR="0" wp14:anchorId="53233C69" wp14:editId="44B0C3CA">
+            <wp:extent cx="5020376" cy="3848637"/>
+            <wp:effectExtent l="0" t="0" r="8890" b="0"/>
+            <wp:docPr id="2070618574" name="Picture 1" descr="A yellow pie chart with white text&#10;&#10;AI-generated content may be incorrect."/>
+            <wp:cNvGraphicFramePr>
+              <a:graphicFrameLocks xmlns:a="http://schemas.openxmlformats.org/drawingml/2006/main" noChangeAspect="1"/>
+            </wp:cNvGraphicFramePr>
+            <a:graphic xmlns:a="http://schemas.openxmlformats.org/drawingml/2006/main">
+              <a:graphicData uri="http://schemas.openxmlformats.org/drawingml/2006/picture">
+                <pic:pic xmlns:pic="http://schemas.openxmlformats.org/drawingml/2006/picture">
+                  <pic:nvPicPr>
+                    <pic:cNvPr id="2070618574" name="Picture 1" descr="A yellow pie chart with white text&#10;&#10;AI-generated content may be incorrect."/>
+                    <pic:cNvPicPr/>
+                  </pic:nvPicPr>
+                  <pic:blipFill>
+                    <a:blip r:embed="rId8"/>
+                    <a:stretch>
+                      <a:fillRect/>
+                    </a:stretch>
+                  </pic:blipFill>
+                  <pic:spPr>
+                    <a:xfrm>
+                      <a:off x="0" y="0"/>
+                      <a:ext cx="5020376" cy="3848637"/>
+                    </a:xfrm>
+                    <a:prstGeom prst="rect">
+                      <a:avLst/>
+                    </a:prstGeom>
+                  </pic:spPr>
+                </pic:pic>
+              </a:graphicData>
+            </a:graphic>
+          </wp:inline>
+        </w:drawing>
+      </w:r>
+    </w:p>
+    <w:p>
+      <w:r>
+        <w:t>Consistency in colour is kept from the stacked bar chart, the tooltips similarly providing the exact values.</w:t>
+      </w:r>
+    </w:p>
+    <w:p>
+      <w:r>
+        <w:t xml:space="preserve">Note that all of these charts have been clearly labelled where needed, meeting </w:t>
+      </w:r>
+      <w:r>
+        <w:rPr>
+          <w:b/>
+          <w:bCs/>
+          <w:u w:val="single"/>
+        </w:rPr>
+        <w:t>Requirement 2.1.7</w:t>
+      </w:r>
+      <w:r>
+        <w:t>.</w:t>
+      </w:r>
+    </w:p>
     <w:sectPr>
       <w:pgSz w:w="11906" w:h="16838"/>
       <w:pgMar w:top="1440" w:right="1440" w:bottom="1440" w:left="1440" w:header="708" w:footer="708" w:gutter="0"/>

</xml_diff>

<commit_message>
completed design section 5
</commit_message>
<xml_diff>
--- a/Design/(3) data_overview.docx
+++ b/Design/(3) data_overview.docx
@@ -24,7 +24,15 @@
     <w:p/>
     <w:p>
       <w:r>
-        <w:t xml:space="preserve">All the data that can be gathered from a replay using Carball is listed on its Github repo in this location </w:t>
+        <w:t xml:space="preserve">All the data that can be gathered from a replay using Carball is listed on its </w:t>
+      </w:r>
+      <w:proofErr w:type="spellStart"/>
+      <w:r>
+        <w:t>Github</w:t>
+      </w:r>
+      <w:proofErr w:type="spellEnd"/>
+      <w:r>
+        <w:t xml:space="preserve"> repo in this location </w:t>
       </w:r>
       <w:hyperlink r:id="rId5" w:history="1">
         <w:r>
@@ -82,8 +90,13 @@
           <w:bCs/>
         </w:rPr>
       </w:pPr>
-      <w:r>
-        <w:t>boost_usage – average boost used per minute</w:t>
+      <w:proofErr w:type="spellStart"/>
+      <w:r>
+        <w:t>boost_usage</w:t>
+      </w:r>
+      <w:proofErr w:type="spellEnd"/>
+      <w:r>
+        <w:t xml:space="preserve"> – average boost used per minute</w:t>
       </w:r>
     </w:p>
     <w:p>
@@ -98,8 +111,13 @@
           <w:bCs/>
         </w:rPr>
       </w:pPr>
-      <w:r>
-        <w:t>wasted_usage – amount of boost used while already max</w:t>
+      <w:proofErr w:type="spellStart"/>
+      <w:r>
+        <w:t>wasted_usage</w:t>
+      </w:r>
+      <w:proofErr w:type="spellEnd"/>
+      <w:r>
+        <w:t xml:space="preserve"> – amount of boost used while already max</w:t>
       </w:r>
       <w:r>
         <w:t>imum</w:t>
@@ -120,8 +138,21 @@
           <w:bCs/>
         </w:rPr>
       </w:pPr>
-      <w:r>
-        <w:t>num_small_boosts and num_large_boosts – number of small/large boost pads collected</w:t>
+      <w:proofErr w:type="spellStart"/>
+      <w:r>
+        <w:t>num_small_boosts</w:t>
+      </w:r>
+      <w:proofErr w:type="spellEnd"/>
+      <w:r>
+        <w:t xml:space="preserve"> and </w:t>
+      </w:r>
+      <w:proofErr w:type="spellStart"/>
+      <w:r>
+        <w:t>num_large_boosts</w:t>
+      </w:r>
+      <w:proofErr w:type="spellEnd"/>
+      <w:r>
+        <w:t xml:space="preserve"> – number of small/large boost pads collected</w:t>
       </w:r>
     </w:p>
     <w:p>
@@ -136,24 +167,30 @@
           <w:bCs/>
         </w:rPr>
       </w:pPr>
+      <w:proofErr w:type="spellStart"/>
       <w:r>
         <w:t>time_no_boost</w:t>
       </w:r>
+      <w:proofErr w:type="spellEnd"/>
       <w:r>
         <w:t xml:space="preserve"> and </w:t>
       </w:r>
+      <w:proofErr w:type="spellStart"/>
       <w:r>
         <w:t>time_low_boost</w:t>
       </w:r>
+      <w:proofErr w:type="spellEnd"/>
       <w:r>
         <w:t xml:space="preserve"> and</w:t>
       </w:r>
       <w:r>
         <w:t xml:space="preserve"> </w:t>
       </w:r>
+      <w:proofErr w:type="spellStart"/>
       <w:r>
         <w:t>time_full_boost</w:t>
       </w:r>
+      <w:proofErr w:type="spellEnd"/>
     </w:p>
     <w:p>
       <w:r>
@@ -216,9 +253,11 @@
           <w:bCs/>
         </w:rPr>
       </w:pPr>
+      <w:proofErr w:type="spellStart"/>
       <w:r>
         <w:t>average_speed</w:t>
       </w:r>
+      <w:proofErr w:type="spellEnd"/>
       <w:r>
         <w:t xml:space="preserve"> – (</w:t>
       </w:r>
@@ -245,8 +284,13 @@
           <w:bCs/>
         </w:rPr>
       </w:pPr>
-      <w:r>
-        <w:t>time_supersonic – time spent at maximum speed</w:t>
+      <w:proofErr w:type="spellStart"/>
+      <w:r>
+        <w:t>time_supersonic</w:t>
+      </w:r>
+      <w:proofErr w:type="spellEnd"/>
+      <w:r>
+        <w:t xml:space="preserve"> – time spent at maximum speed</w:t>
       </w:r>
       <w:r>
         <w:t xml:space="preserve"> (will be calculated as %)</w:t>
@@ -264,8 +308,29 @@
           <w:bCs/>
         </w:rPr>
       </w:pPr>
-      <w:r>
-        <w:t>time_on_ground / time_low_in_air / time_high_in_air – if calculated as %’s, will sum to 100%</w:t>
+      <w:proofErr w:type="spellStart"/>
+      <w:r>
+        <w:t>time_on_ground</w:t>
+      </w:r>
+      <w:proofErr w:type="spellEnd"/>
+      <w:r>
+        <w:t xml:space="preserve"> / </w:t>
+      </w:r>
+      <w:proofErr w:type="spellStart"/>
+      <w:r>
+        <w:t>time_low_in_air</w:t>
+      </w:r>
+      <w:proofErr w:type="spellEnd"/>
+      <w:r>
+        <w:t xml:space="preserve"> / </w:t>
+      </w:r>
+      <w:proofErr w:type="spellStart"/>
+      <w:r>
+        <w:t>time_high_in_air</w:t>
+      </w:r>
+      <w:proofErr w:type="spellEnd"/>
+      <w:r>
+        <w:t xml:space="preserve"> – if calculated as %’s, will sum to 100%</w:t>
       </w:r>
       <w:r>
         <w:t>, so can be represented with a stacked bar chart (</w:t>
@@ -313,9 +378,27 @@
           <w:bCs/>
         </w:rPr>
       </w:pPr>
-      <w:r>
-        <w:t>time_most_back _player / time_between_players / time_most_forward_player</w:t>
-      </w:r>
+      <w:proofErr w:type="spellStart"/>
+      <w:r>
+        <w:t>time_most_back</w:t>
+      </w:r>
+      <w:proofErr w:type="spellEnd"/>
+      <w:r>
+        <w:t xml:space="preserve"> _player / </w:t>
+      </w:r>
+      <w:proofErr w:type="spellStart"/>
+      <w:r>
+        <w:t>time_between_players</w:t>
+      </w:r>
+      <w:proofErr w:type="spellEnd"/>
+      <w:r>
+        <w:t xml:space="preserve"> / </w:t>
+      </w:r>
+      <w:proofErr w:type="spellStart"/>
+      <w:r>
+        <w:t>time_most_forward_player</w:t>
+      </w:r>
+      <w:proofErr w:type="spellEnd"/>
       <w:r>
         <w:t xml:space="preserve"> – pie chart</w:t>
       </w:r>
@@ -332,15 +415,19 @@
           <w:bCs/>
         </w:rPr>
       </w:pPr>
+      <w:proofErr w:type="spellStart"/>
       <w:r>
         <w:t>time_closest_to_ball</w:t>
       </w:r>
+      <w:proofErr w:type="spellEnd"/>
       <w:r>
         <w:t xml:space="preserve">/ neither (calculated) / </w:t>
       </w:r>
+      <w:proofErr w:type="spellStart"/>
       <w:r>
         <w:t>time_farthest_from_ball</w:t>
       </w:r>
+      <w:proofErr w:type="spellEnd"/>
       <w:r>
         <w:t xml:space="preserve"> – pie chart</w:t>
       </w:r>
@@ -357,9 +444,19 @@
           <w:bCs/>
         </w:rPr>
       </w:pPr>
-      <w:r>
-        <w:t>time_behind_ball / time_in_front_ball</w:t>
-      </w:r>
+      <w:proofErr w:type="spellStart"/>
+      <w:r>
+        <w:t>time_behind_ball</w:t>
+      </w:r>
+      <w:proofErr w:type="spellEnd"/>
+      <w:r>
+        <w:t xml:space="preserve"> / </w:t>
+      </w:r>
+      <w:proofErr w:type="spellStart"/>
+      <w:r>
+        <w:t>time_in_front_ball</w:t>
+      </w:r>
+      <w:proofErr w:type="spellEnd"/>
       <w:r>
         <w:t xml:space="preserve"> – pie chart</w:t>
       </w:r>
@@ -389,11 +486,32 @@
           <w:bCs/>
         </w:rPr>
       </w:pPr>
+      <w:proofErr w:type="spellStart"/>
       <w:r>
         <w:t>time_</w:t>
       </w:r>
       <w:r>
-        <w:t>defending_third / time_neutral_third / time_attacking_third – stacked bar chart</w:t>
+        <w:t>defending_third</w:t>
+      </w:r>
+      <w:proofErr w:type="spellEnd"/>
+      <w:r>
+        <w:t xml:space="preserve"> / </w:t>
+      </w:r>
+      <w:proofErr w:type="spellStart"/>
+      <w:r>
+        <w:t>time_neutral_third</w:t>
+      </w:r>
+      <w:proofErr w:type="spellEnd"/>
+      <w:r>
+        <w:t xml:space="preserve"> / </w:t>
+      </w:r>
+      <w:proofErr w:type="spellStart"/>
+      <w:r>
+        <w:t>time_attacking_third</w:t>
+      </w:r>
+      <w:proofErr w:type="spellEnd"/>
+      <w:r>
+        <w:t xml:space="preserve"> – stacked bar chart</w:t>
       </w:r>
     </w:p>
     <w:p>
@@ -465,9 +583,11 @@
           <w:bCs/>
         </w:rPr>
       </w:pPr>
+      <w:proofErr w:type="spellStart"/>
       <w:r>
         <w:t>num_demos_inflicted</w:t>
       </w:r>
+      <w:proofErr w:type="spellEnd"/>
     </w:p>
     <w:p>
       <w:pPr>
@@ -481,9 +601,29 @@
           <w:bCs/>
         </w:rPr>
       </w:pPr>
+      <w:proofErr w:type="spellStart"/>
       <w:r>
         <w:t>num_demos_taken</w:t>
       </w:r>
+      <w:proofErr w:type="spellEnd"/>
+    </w:p>
+    <w:p>
+      <w:pPr>
+        <w:pStyle w:val="ListParagraph"/>
+        <w:numPr>
+          <w:ilvl w:val="0"/>
+          <w:numId w:val="6"/>
+        </w:numPr>
+        <w:rPr>
+          <w:b/>
+          <w:bCs/>
+        </w:rPr>
+      </w:pPr>
+      <w:proofErr w:type="spellStart"/>
+      <w:r>
+        <w:t>num_stolen_boosts</w:t>
+      </w:r>
+      <w:proofErr w:type="spellEnd"/>
     </w:p>
     <w:p>
       <w:pPr>
@@ -531,8 +671,13 @@
           <w:bCs/>
         </w:rPr>
       </w:pPr>
-      <w:r>
-        <w:t>average_duration (possession)</w:t>
+      <w:proofErr w:type="spellStart"/>
+      <w:r>
+        <w:t>average_duration</w:t>
+      </w:r>
+      <w:proofErr w:type="spellEnd"/>
+      <w:r>
+        <w:t xml:space="preserve"> (possession)</w:t>
       </w:r>
     </w:p>
     <w:p>
@@ -656,6 +801,7 @@
         <w:rPr>
           <w:b/>
           <w:bCs/>
+          <w:noProof/>
         </w:rPr>
         <w:lastRenderedPageBreak/>
         <w:drawing>
@@ -733,6 +879,9 @@
     </w:p>
     <w:p>
       <w:r>
+        <w:rPr>
+          <w:noProof/>
+        </w:rPr>
         <w:drawing>
           <wp:inline distT="0" distB="0" distL="0" distR="0" wp14:anchorId="0DD2FFB5" wp14:editId="0CCA7E8B">
             <wp:extent cx="5731510" cy="3595370"/>
@@ -820,6 +969,9 @@
     </w:p>
     <w:p>
       <w:r>
+        <w:rPr>
+          <w:noProof/>
+        </w:rPr>
         <w:drawing>
           <wp:inline distT="0" distB="0" distL="0" distR="0" wp14:anchorId="53233C69" wp14:editId="44B0C3CA">
             <wp:extent cx="5020376" cy="3848637"/>

</xml_diff>